<commit_message>
style: rapikan layout laporan DAST (justify, tabel tidak terpotong, margin)
- Semua baris tabel cantSplit (tidak terpotong antar-halaman)
- Setiap kartu rekomendasi tetap utuh dalam satu halaman
- Ukuran gambar diseimbangkan; heading & spasi konsisten
</commit_message>
<xml_diff>
--- a/Kelompok-6_DAST_P6/Kelompok-6_DAST_P6_DevSecOps.docx
+++ b/Kelompok-6_DAST_P6/Kelompok-6_DAST_P6_DevSecOps.docx
@@ -186,6 +186,7 @@
       </w:tblGrid>
       <w:tr>
         <w:trPr>
+          <w:cantSplit/>
           <w:tblHeader/>
         </w:trPr>
         <w:tc>
@@ -280,6 +281,9 @@
         </w:tc>
       </w:tr>
       <w:tr>
+        <w:trPr>
+          <w:cantSplit/>
+        </w:trPr>
         <w:tc>
           <w:tcPr>
             <w:tcW w:type="dxa" w:w="650"/>
@@ -363,6 +367,9 @@
         </w:tc>
       </w:tr>
       <w:tr>
+        <w:trPr>
+          <w:cantSplit/>
+        </w:trPr>
         <w:tc>
           <w:tcPr>
             <w:tcW w:type="dxa" w:w="650"/>
@@ -449,6 +456,9 @@
         </w:tc>
       </w:tr>
       <w:tr>
+        <w:trPr>
+          <w:cantSplit/>
+        </w:trPr>
         <w:tc>
           <w:tcPr>
             <w:tcW w:type="dxa" w:w="650"/>
@@ -532,6 +542,9 @@
         </w:tc>
       </w:tr>
       <w:tr>
+        <w:trPr>
+          <w:cantSplit/>
+        </w:trPr>
         <w:tc>
           <w:tcPr>
             <w:tcW w:type="dxa" w:w="650"/>
@@ -618,6 +631,9 @@
         </w:tc>
       </w:tr>
       <w:tr>
+        <w:trPr>
+          <w:cantSplit/>
+        </w:trPr>
         <w:tc>
           <w:tcPr>
             <w:tcW w:type="dxa" w:w="650"/>
@@ -701,6 +717,9 @@
         </w:tc>
       </w:tr>
       <w:tr>
+        <w:trPr>
+          <w:cantSplit/>
+        </w:trPr>
         <w:tc>
           <w:tcPr>
             <w:tcW w:type="dxa" w:w="650"/>
@@ -787,6 +806,9 @@
         </w:tc>
       </w:tr>
       <w:tr>
+        <w:trPr>
+          <w:cantSplit/>
+        </w:trPr>
         <w:tc>
           <w:tcPr>
             <w:tcW w:type="dxa" w:w="650"/>
@@ -1016,6 +1038,7 @@
       </w:tblGrid>
       <w:tr>
         <w:trPr>
+          <w:cantSplit/>
           <w:tblHeader/>
         </w:trPr>
         <w:tc>
@@ -1110,6 +1133,9 @@
         </w:tc>
       </w:tr>
       <w:tr>
+        <w:trPr>
+          <w:cantSplit/>
+        </w:trPr>
         <w:tc>
           <w:tcPr>
             <w:tcW w:type="dxa" w:w="2900"/>
@@ -1198,6 +1224,9 @@
         </w:tc>
       </w:tr>
       <w:tr>
+        <w:trPr>
+          <w:cantSplit/>
+        </w:trPr>
         <w:tc>
           <w:tcPr>
             <w:tcW w:type="dxa" w:w="2900"/>
@@ -1288,6 +1317,9 @@
         </w:tc>
       </w:tr>
       <w:tr>
+        <w:trPr>
+          <w:cantSplit/>
+        </w:trPr>
         <w:tc>
           <w:tcPr>
             <w:tcW w:type="dxa" w:w="2900"/>
@@ -1376,6 +1408,9 @@
         </w:tc>
       </w:tr>
       <w:tr>
+        <w:trPr>
+          <w:cantSplit/>
+        </w:trPr>
         <w:tc>
           <w:tcPr>
             <w:tcW w:type="dxa" w:w="2900"/>
@@ -1540,6 +1575,9 @@
         <w:gridCol w:w="5300"/>
       </w:tblGrid>
       <w:tr>
+        <w:trPr>
+          <w:cantSplit/>
+        </w:trPr>
         <w:tc>
           <w:tcPr>
             <w:tcW w:type="dxa" w:w="2600"/>
@@ -1598,6 +1636,9 @@
         </w:tc>
       </w:tr>
       <w:tr>
+        <w:trPr>
+          <w:cantSplit/>
+        </w:trPr>
         <w:tc>
           <w:tcPr>
             <w:tcW w:type="dxa" w:w="2600"/>
@@ -1658,6 +1699,9 @@
         </w:tc>
       </w:tr>
       <w:tr>
+        <w:trPr>
+          <w:cantSplit/>
+        </w:trPr>
         <w:tc>
           <w:tcPr>
             <w:tcW w:type="dxa" w:w="2600"/>
@@ -1716,6 +1760,9 @@
         </w:tc>
       </w:tr>
       <w:tr>
+        <w:trPr>
+          <w:cantSplit/>
+        </w:trPr>
         <w:tc>
           <w:tcPr>
             <w:tcW w:type="dxa" w:w="2600"/>
@@ -1776,6 +1823,9 @@
         </w:tc>
       </w:tr>
       <w:tr>
+        <w:trPr>
+          <w:cantSplit/>
+        </w:trPr>
         <w:tc>
           <w:tcPr>
             <w:tcW w:type="dxa" w:w="2600"/>
@@ -1834,6 +1884,9 @@
         </w:tc>
       </w:tr>
       <w:tr>
+        <w:trPr>
+          <w:cantSplit/>
+        </w:trPr>
         <w:tc>
           <w:tcPr>
             <w:tcW w:type="dxa" w:w="2600"/>
@@ -1894,6 +1947,9 @@
         </w:tc>
       </w:tr>
       <w:tr>
+        <w:trPr>
+          <w:cantSplit/>
+        </w:trPr>
         <w:tc>
           <w:tcPr>
             <w:tcW w:type="dxa" w:w="2600"/>
@@ -2025,6 +2081,7 @@
       </w:tblGrid>
       <w:tr>
         <w:trPr>
+          <w:cantSplit/>
           <w:tblHeader/>
         </w:trPr>
         <w:tc>
@@ -2119,6 +2176,9 @@
         </w:tc>
       </w:tr>
       <w:tr>
+        <w:trPr>
+          <w:cantSplit/>
+        </w:trPr>
         <w:tc>
           <w:tcPr>
             <w:tcW w:type="dxa" w:w="2300"/>
@@ -2202,6 +2262,9 @@
         </w:tc>
       </w:tr>
       <w:tr>
+        <w:trPr>
+          <w:cantSplit/>
+        </w:trPr>
         <w:tc>
           <w:tcPr>
             <w:tcW w:type="dxa" w:w="2300"/>
@@ -2288,6 +2351,9 @@
         </w:tc>
       </w:tr>
       <w:tr>
+        <w:trPr>
+          <w:cantSplit/>
+        </w:trPr>
         <w:tc>
           <w:tcPr>
             <w:tcW w:type="dxa" w:w="2300"/>
@@ -2371,6 +2437,9 @@
         </w:tc>
       </w:tr>
       <w:tr>
+        <w:trPr>
+          <w:cantSplit/>
+        </w:trPr>
         <w:tc>
           <w:tcPr>
             <w:tcW w:type="dxa" w:w="2300"/>
@@ -2457,6 +2526,9 @@
         </w:tc>
       </w:tr>
       <w:tr>
+        <w:trPr>
+          <w:cantSplit/>
+        </w:trPr>
         <w:tc>
           <w:tcPr>
             <w:tcW w:type="dxa" w:w="2300"/>
@@ -2540,6 +2612,9 @@
         </w:tc>
       </w:tr>
       <w:tr>
+        <w:trPr>
+          <w:cantSplit/>
+        </w:trPr>
         <w:tc>
           <w:tcPr>
             <w:tcW w:type="dxa" w:w="2300"/>
@@ -2626,6 +2701,9 @@
         </w:tc>
       </w:tr>
       <w:tr>
+        <w:trPr>
+          <w:cantSplit/>
+        </w:trPr>
         <w:tc>
           <w:tcPr>
             <w:tcW w:type="dxa" w:w="2300"/>
@@ -2709,6 +2787,9 @@
         </w:tc>
       </w:tr>
       <w:tr>
+        <w:trPr>
+          <w:cantSplit/>
+        </w:trPr>
         <w:tc>
           <w:tcPr>
             <w:tcW w:type="dxa" w:w="2300"/>
@@ -2795,6 +2876,9 @@
         </w:tc>
       </w:tr>
       <w:tr>
+        <w:trPr>
+          <w:cantSplit/>
+        </w:trPr>
         <w:tc>
           <w:tcPr>
             <w:tcW w:type="dxa" w:w="2300"/>
@@ -2887,7 +2971,7 @@
       <w:r>
         <w:drawing>
           <wp:inline distT="0" distB="0" distL="0" distR="0">
-            <wp:extent cx="5143500" cy="2247900"/>
+            <wp:extent cx="4476750" cy="1962150"/>
             <wp:effectExtent t="0" r="0" b="0" l="0"/>
             <wp:docPr id="2" name=""/>
             <wp:cNvGraphicFramePr>
@@ -2912,7 +2996,7 @@
                   <pic:spPr bwMode="auto">
                     <a:xfrm>
                       <a:off x="0" y="0"/>
-                      <a:ext cx="5143500" cy="2247900"/>
+                      <a:ext cx="4476750" cy="1962150"/>
                     </a:xfrm>
                     <a:prstGeom prst="rect">
                       <a:avLst/>
@@ -2951,7 +3035,7 @@
       <w:r>
         <w:drawing>
           <wp:inline distT="0" distB="0" distL="0" distR="0">
-            <wp:extent cx="4762500" cy="2190750"/>
+            <wp:extent cx="4286250" cy="1971675"/>
             <wp:effectExtent t="0" r="0" b="0" l="0"/>
             <wp:docPr id="3" name=""/>
             <wp:cNvGraphicFramePr>
@@ -2976,7 +3060,7 @@
                   <pic:spPr bwMode="auto">
                     <a:xfrm>
                       <a:off x="0" y="0"/>
-                      <a:ext cx="4762500" cy="2190750"/>
+                      <a:ext cx="4286250" cy="1971675"/>
                     </a:xfrm>
                     <a:prstGeom prst="rect">
                       <a:avLst/>
@@ -3058,6 +3142,7 @@
       </w:tblGrid>
       <w:tr>
         <w:trPr>
+          <w:cantSplit/>
           <w:tblHeader/>
         </w:trPr>
         <w:tc>
@@ -3122,6 +3207,9 @@
         </w:tc>
       </w:tr>
       <w:tr>
+        <w:trPr>
+          <w:cantSplit/>
+        </w:trPr>
         <w:tc>
           <w:tcPr>
             <w:tcW w:type="dxa" w:w="2800"/>
@@ -3180,6 +3268,9 @@
         </w:tc>
       </w:tr>
       <w:tr>
+        <w:trPr>
+          <w:cantSplit/>
+        </w:trPr>
         <w:tc>
           <w:tcPr>
             <w:tcW w:type="dxa" w:w="2800"/>
@@ -3240,6 +3331,9 @@
         </w:tc>
       </w:tr>
       <w:tr>
+        <w:trPr>
+          <w:cantSplit/>
+        </w:trPr>
         <w:tc>
           <w:tcPr>
             <w:tcW w:type="dxa" w:w="2800"/>
@@ -3298,6 +3392,9 @@
         </w:tc>
       </w:tr>
       <w:tr>
+        <w:trPr>
+          <w:cantSplit/>
+        </w:trPr>
         <w:tc>
           <w:tcPr>
             <w:tcW w:type="dxa" w:w="2800"/>
@@ -3866,6 +3963,7 @@
       </w:tblGrid>
       <w:tr>
         <w:trPr>
+          <w:cantSplit/>
           <w:tblHeader/>
         </w:trPr>
         <w:tc>
@@ -5824,6 +5922,7 @@
       </w:tblGrid>
       <w:tr>
         <w:trPr>
+          <w:cantSplit/>
           <w:tblHeader/>
         </w:trPr>
         <w:tc>
@@ -7320,6 +7419,9 @@
         <w:gridCol w:w="6000"/>
       </w:tblGrid>
       <w:tr>
+        <w:trPr>
+          <w:cantSplit/>
+        </w:trPr>
         <w:tc>
           <w:tcPr>
             <w:tcW w:type="dxa" w:w="1900"/>
@@ -7333,6 +7435,7 @@
           </w:tcPr>
           <w:p>
             <w:pPr>
+              <w:keepNext/>
               <w:spacing w:after="0" w:line="276" w:lineRule="auto"/>
               <w:jc w:val="left"/>
             </w:pPr>
@@ -7362,6 +7465,7 @@
           </w:tcPr>
           <w:p>
             <w:pPr>
+              <w:keepNext/>
               <w:spacing w:after="0" w:line="276" w:lineRule="auto"/>
               <w:jc w:val="left"/>
             </w:pPr>
@@ -7378,6 +7482,9 @@
         </w:tc>
       </w:tr>
       <w:tr>
+        <w:trPr>
+          <w:cantSplit/>
+        </w:trPr>
         <w:tc>
           <w:tcPr>
             <w:tcW w:type="dxa" w:w="1900"/>
@@ -7392,6 +7499,7 @@
           </w:tcPr>
           <w:p>
             <w:pPr>
+              <w:keepNext/>
               <w:spacing w:after="0" w:line="276" w:lineRule="auto"/>
               <w:jc w:val="left"/>
             </w:pPr>
@@ -7422,6 +7530,7 @@
           </w:tcPr>
           <w:p>
             <w:pPr>
+              <w:keepNext/>
               <w:spacing w:after="0" w:line="264"/>
             </w:pPr>
             <w:r>
@@ -7439,6 +7548,9 @@
         </w:tc>
       </w:tr>
       <w:tr>
+        <w:trPr>
+          <w:cantSplit/>
+        </w:trPr>
         <w:tc>
           <w:tcPr>
             <w:tcW w:type="dxa" w:w="1900"/>
@@ -7452,6 +7564,7 @@
           </w:tcPr>
           <w:p>
             <w:pPr>
+              <w:keepNext/>
               <w:spacing w:after="0" w:line="276" w:lineRule="auto"/>
               <w:jc w:val="left"/>
             </w:pPr>
@@ -7481,6 +7594,7 @@
           </w:tcPr>
           <w:p>
             <w:pPr>
+              <w:keepNext/>
               <w:spacing w:after="0" w:line="276" w:lineRule="auto"/>
               <w:jc w:val="left"/>
             </w:pPr>
@@ -7497,6 +7611,9 @@
         </w:tc>
       </w:tr>
       <w:tr>
+        <w:trPr>
+          <w:cantSplit/>
+        </w:trPr>
         <w:tc>
           <w:tcPr>
             <w:tcW w:type="dxa" w:w="1900"/>
@@ -7592,6 +7709,9 @@
         <w:gridCol w:w="6000"/>
       </w:tblGrid>
       <w:tr>
+        <w:trPr>
+          <w:cantSplit/>
+        </w:trPr>
         <w:tc>
           <w:tcPr>
             <w:tcW w:type="dxa" w:w="1900"/>
@@ -7605,6 +7725,7 @@
           </w:tcPr>
           <w:p>
             <w:pPr>
+              <w:keepNext/>
               <w:spacing w:after="0" w:line="276" w:lineRule="auto"/>
               <w:jc w:val="left"/>
             </w:pPr>
@@ -7634,6 +7755,7 @@
           </w:tcPr>
           <w:p>
             <w:pPr>
+              <w:keepNext/>
               <w:spacing w:after="0" w:line="276" w:lineRule="auto"/>
               <w:jc w:val="left"/>
             </w:pPr>
@@ -7650,6 +7772,9 @@
         </w:tc>
       </w:tr>
       <w:tr>
+        <w:trPr>
+          <w:cantSplit/>
+        </w:trPr>
         <w:tc>
           <w:tcPr>
             <w:tcW w:type="dxa" w:w="1900"/>
@@ -7664,6 +7789,7 @@
           </w:tcPr>
           <w:p>
             <w:pPr>
+              <w:keepNext/>
               <w:spacing w:after="0" w:line="276" w:lineRule="auto"/>
               <w:jc w:val="left"/>
             </w:pPr>
@@ -7694,6 +7820,7 @@
           </w:tcPr>
           <w:p>
             <w:pPr>
+              <w:keepNext/>
               <w:spacing w:after="0" w:line="264"/>
             </w:pPr>
             <w:r>
@@ -7711,6 +7838,9 @@
         </w:tc>
       </w:tr>
       <w:tr>
+        <w:trPr>
+          <w:cantSplit/>
+        </w:trPr>
         <w:tc>
           <w:tcPr>
             <w:tcW w:type="dxa" w:w="1900"/>
@@ -7724,6 +7854,7 @@
           </w:tcPr>
           <w:p>
             <w:pPr>
+              <w:keepNext/>
               <w:spacing w:after="0" w:line="276" w:lineRule="auto"/>
               <w:jc w:val="left"/>
             </w:pPr>
@@ -7753,6 +7884,7 @@
           </w:tcPr>
           <w:p>
             <w:pPr>
+              <w:keepNext/>
               <w:spacing w:after="0" w:line="276" w:lineRule="auto"/>
               <w:jc w:val="left"/>
             </w:pPr>
@@ -7769,6 +7901,9 @@
         </w:tc>
       </w:tr>
       <w:tr>
+        <w:trPr>
+          <w:cantSplit/>
+        </w:trPr>
         <w:tc>
           <w:tcPr>
             <w:tcW w:type="dxa" w:w="1900"/>
@@ -7864,6 +7999,9 @@
         <w:gridCol w:w="6000"/>
       </w:tblGrid>
       <w:tr>
+        <w:trPr>
+          <w:cantSplit/>
+        </w:trPr>
         <w:tc>
           <w:tcPr>
             <w:tcW w:type="dxa" w:w="1900"/>
@@ -7877,6 +8015,7 @@
           </w:tcPr>
           <w:p>
             <w:pPr>
+              <w:keepNext/>
               <w:spacing w:after="0" w:line="276" w:lineRule="auto"/>
               <w:jc w:val="left"/>
             </w:pPr>
@@ -7906,6 +8045,7 @@
           </w:tcPr>
           <w:p>
             <w:pPr>
+              <w:keepNext/>
               <w:spacing w:after="0" w:line="276" w:lineRule="auto"/>
               <w:jc w:val="left"/>
             </w:pPr>
@@ -7922,6 +8062,9 @@
         </w:tc>
       </w:tr>
       <w:tr>
+        <w:trPr>
+          <w:cantSplit/>
+        </w:trPr>
         <w:tc>
           <w:tcPr>
             <w:tcW w:type="dxa" w:w="1900"/>
@@ -7936,6 +8079,7 @@
           </w:tcPr>
           <w:p>
             <w:pPr>
+              <w:keepNext/>
               <w:spacing w:after="0" w:line="276" w:lineRule="auto"/>
               <w:jc w:val="left"/>
             </w:pPr>
@@ -7966,6 +8110,7 @@
           </w:tcPr>
           <w:p>
             <w:pPr>
+              <w:keepNext/>
               <w:spacing w:after="0" w:line="264"/>
             </w:pPr>
             <w:r>
@@ -7983,6 +8128,9 @@
         </w:tc>
       </w:tr>
       <w:tr>
+        <w:trPr>
+          <w:cantSplit/>
+        </w:trPr>
         <w:tc>
           <w:tcPr>
             <w:tcW w:type="dxa" w:w="1900"/>
@@ -7996,6 +8144,7 @@
           </w:tcPr>
           <w:p>
             <w:pPr>
+              <w:keepNext/>
               <w:spacing w:after="0" w:line="276" w:lineRule="auto"/>
               <w:jc w:val="left"/>
             </w:pPr>
@@ -8025,6 +8174,7 @@
           </w:tcPr>
           <w:p>
             <w:pPr>
+              <w:keepNext/>
               <w:spacing w:after="0" w:line="276" w:lineRule="auto"/>
               <w:jc w:val="left"/>
             </w:pPr>
@@ -8041,6 +8191,9 @@
         </w:tc>
       </w:tr>
       <w:tr>
+        <w:trPr>
+          <w:cantSplit/>
+        </w:trPr>
         <w:tc>
           <w:tcPr>
             <w:tcW w:type="dxa" w:w="1900"/>
@@ -8136,6 +8289,9 @@
         <w:gridCol w:w="6000"/>
       </w:tblGrid>
       <w:tr>
+        <w:trPr>
+          <w:cantSplit/>
+        </w:trPr>
         <w:tc>
           <w:tcPr>
             <w:tcW w:type="dxa" w:w="1900"/>
@@ -8149,6 +8305,7 @@
           </w:tcPr>
           <w:p>
             <w:pPr>
+              <w:keepNext/>
               <w:spacing w:after="0" w:line="276" w:lineRule="auto"/>
               <w:jc w:val="left"/>
             </w:pPr>
@@ -8178,6 +8335,7 @@
           </w:tcPr>
           <w:p>
             <w:pPr>
+              <w:keepNext/>
               <w:spacing w:after="0" w:line="276" w:lineRule="auto"/>
               <w:jc w:val="left"/>
             </w:pPr>
@@ -8194,6 +8352,9 @@
         </w:tc>
       </w:tr>
       <w:tr>
+        <w:trPr>
+          <w:cantSplit/>
+        </w:trPr>
         <w:tc>
           <w:tcPr>
             <w:tcW w:type="dxa" w:w="1900"/>
@@ -8208,6 +8369,7 @@
           </w:tcPr>
           <w:p>
             <w:pPr>
+              <w:keepNext/>
               <w:spacing w:after="0" w:line="276" w:lineRule="auto"/>
               <w:jc w:val="left"/>
             </w:pPr>
@@ -8238,6 +8400,7 @@
           </w:tcPr>
           <w:p>
             <w:pPr>
+              <w:keepNext/>
               <w:spacing w:after="0" w:line="264"/>
             </w:pPr>
             <w:r>
@@ -8255,6 +8418,9 @@
         </w:tc>
       </w:tr>
       <w:tr>
+        <w:trPr>
+          <w:cantSplit/>
+        </w:trPr>
         <w:tc>
           <w:tcPr>
             <w:tcW w:type="dxa" w:w="1900"/>
@@ -8268,6 +8434,7 @@
           </w:tcPr>
           <w:p>
             <w:pPr>
+              <w:keepNext/>
               <w:spacing w:after="0" w:line="276" w:lineRule="auto"/>
               <w:jc w:val="left"/>
             </w:pPr>
@@ -8297,6 +8464,7 @@
           </w:tcPr>
           <w:p>
             <w:pPr>
+              <w:keepNext/>
               <w:spacing w:after="0" w:line="276" w:lineRule="auto"/>
               <w:jc w:val="left"/>
             </w:pPr>
@@ -8313,6 +8481,9 @@
         </w:tc>
       </w:tr>
       <w:tr>
+        <w:trPr>
+          <w:cantSplit/>
+        </w:trPr>
         <w:tc>
           <w:tcPr>
             <w:tcW w:type="dxa" w:w="1900"/>
@@ -8408,6 +8579,9 @@
         <w:gridCol w:w="6000"/>
       </w:tblGrid>
       <w:tr>
+        <w:trPr>
+          <w:cantSplit/>
+        </w:trPr>
         <w:tc>
           <w:tcPr>
             <w:tcW w:type="dxa" w:w="1900"/>
@@ -8421,6 +8595,7 @@
           </w:tcPr>
           <w:p>
             <w:pPr>
+              <w:keepNext/>
               <w:spacing w:after="0" w:line="276" w:lineRule="auto"/>
               <w:jc w:val="left"/>
             </w:pPr>
@@ -8450,6 +8625,7 @@
           </w:tcPr>
           <w:p>
             <w:pPr>
+              <w:keepNext/>
               <w:spacing w:after="0" w:line="276" w:lineRule="auto"/>
               <w:jc w:val="left"/>
             </w:pPr>
@@ -8466,6 +8642,9 @@
         </w:tc>
       </w:tr>
       <w:tr>
+        <w:trPr>
+          <w:cantSplit/>
+        </w:trPr>
         <w:tc>
           <w:tcPr>
             <w:tcW w:type="dxa" w:w="1900"/>
@@ -8480,6 +8659,7 @@
           </w:tcPr>
           <w:p>
             <w:pPr>
+              <w:keepNext/>
               <w:spacing w:after="0" w:line="276" w:lineRule="auto"/>
               <w:jc w:val="left"/>
             </w:pPr>
@@ -8510,6 +8690,7 @@
           </w:tcPr>
           <w:p>
             <w:pPr>
+              <w:keepNext/>
               <w:spacing w:after="0" w:line="264"/>
             </w:pPr>
             <w:r>
@@ -8527,6 +8708,9 @@
         </w:tc>
       </w:tr>
       <w:tr>
+        <w:trPr>
+          <w:cantSplit/>
+        </w:trPr>
         <w:tc>
           <w:tcPr>
             <w:tcW w:type="dxa" w:w="1900"/>
@@ -8540,6 +8724,7 @@
           </w:tcPr>
           <w:p>
             <w:pPr>
+              <w:keepNext/>
               <w:spacing w:after="0" w:line="276" w:lineRule="auto"/>
               <w:jc w:val="left"/>
             </w:pPr>
@@ -8569,6 +8754,7 @@
           </w:tcPr>
           <w:p>
             <w:pPr>
+              <w:keepNext/>
               <w:spacing w:after="0" w:line="276" w:lineRule="auto"/>
               <w:jc w:val="left"/>
             </w:pPr>
@@ -8585,6 +8771,9 @@
         </w:tc>
       </w:tr>
       <w:tr>
+        <w:trPr>
+          <w:cantSplit/>
+        </w:trPr>
         <w:tc>
           <w:tcPr>
             <w:tcW w:type="dxa" w:w="1900"/>
@@ -8680,6 +8869,9 @@
         <w:gridCol w:w="6000"/>
       </w:tblGrid>
       <w:tr>
+        <w:trPr>
+          <w:cantSplit/>
+        </w:trPr>
         <w:tc>
           <w:tcPr>
             <w:tcW w:type="dxa" w:w="1900"/>
@@ -8693,6 +8885,7 @@
           </w:tcPr>
           <w:p>
             <w:pPr>
+              <w:keepNext/>
               <w:spacing w:after="0" w:line="276" w:lineRule="auto"/>
               <w:jc w:val="left"/>
             </w:pPr>
@@ -8722,6 +8915,7 @@
           </w:tcPr>
           <w:p>
             <w:pPr>
+              <w:keepNext/>
               <w:spacing w:after="0" w:line="276" w:lineRule="auto"/>
               <w:jc w:val="left"/>
             </w:pPr>
@@ -8738,6 +8932,9 @@
         </w:tc>
       </w:tr>
       <w:tr>
+        <w:trPr>
+          <w:cantSplit/>
+        </w:trPr>
         <w:tc>
           <w:tcPr>
             <w:tcW w:type="dxa" w:w="1900"/>
@@ -8752,6 +8949,7 @@
           </w:tcPr>
           <w:p>
             <w:pPr>
+              <w:keepNext/>
               <w:spacing w:after="0" w:line="276" w:lineRule="auto"/>
               <w:jc w:val="left"/>
             </w:pPr>
@@ -8782,6 +8980,7 @@
           </w:tcPr>
           <w:p>
             <w:pPr>
+              <w:keepNext/>
               <w:spacing w:after="0" w:line="264"/>
             </w:pPr>
             <w:r>
@@ -8799,6 +8998,9 @@
         </w:tc>
       </w:tr>
       <w:tr>
+        <w:trPr>
+          <w:cantSplit/>
+        </w:trPr>
         <w:tc>
           <w:tcPr>
             <w:tcW w:type="dxa" w:w="1900"/>
@@ -8812,6 +9014,7 @@
           </w:tcPr>
           <w:p>
             <w:pPr>
+              <w:keepNext/>
               <w:spacing w:after="0" w:line="276" w:lineRule="auto"/>
               <w:jc w:val="left"/>
             </w:pPr>
@@ -8841,6 +9044,7 @@
           </w:tcPr>
           <w:p>
             <w:pPr>
+              <w:keepNext/>
               <w:spacing w:after="0" w:line="276" w:lineRule="auto"/>
               <w:jc w:val="left"/>
             </w:pPr>
@@ -8857,6 +9061,9 @@
         </w:tc>
       </w:tr>
       <w:tr>
+        <w:trPr>
+          <w:cantSplit/>
+        </w:trPr>
         <w:tc>
           <w:tcPr>
             <w:tcW w:type="dxa" w:w="1900"/>
@@ -8952,6 +9159,9 @@
         <w:gridCol w:w="6000"/>
       </w:tblGrid>
       <w:tr>
+        <w:trPr>
+          <w:cantSplit/>
+        </w:trPr>
         <w:tc>
           <w:tcPr>
             <w:tcW w:type="dxa" w:w="1900"/>
@@ -8965,6 +9175,7 @@
           </w:tcPr>
           <w:p>
             <w:pPr>
+              <w:keepNext/>
               <w:spacing w:after="0" w:line="276" w:lineRule="auto"/>
               <w:jc w:val="left"/>
             </w:pPr>
@@ -8994,6 +9205,7 @@
           </w:tcPr>
           <w:p>
             <w:pPr>
+              <w:keepNext/>
               <w:spacing w:after="0" w:line="276" w:lineRule="auto"/>
               <w:jc w:val="left"/>
             </w:pPr>
@@ -9010,6 +9222,9 @@
         </w:tc>
       </w:tr>
       <w:tr>
+        <w:trPr>
+          <w:cantSplit/>
+        </w:trPr>
         <w:tc>
           <w:tcPr>
             <w:tcW w:type="dxa" w:w="1900"/>
@@ -9024,6 +9239,7 @@
           </w:tcPr>
           <w:p>
             <w:pPr>
+              <w:keepNext/>
               <w:spacing w:after="0" w:line="276" w:lineRule="auto"/>
               <w:jc w:val="left"/>
             </w:pPr>
@@ -9054,6 +9270,7 @@
           </w:tcPr>
           <w:p>
             <w:pPr>
+              <w:keepNext/>
               <w:spacing w:after="0" w:line="264"/>
             </w:pPr>
             <w:r>
@@ -9071,6 +9288,9 @@
         </w:tc>
       </w:tr>
       <w:tr>
+        <w:trPr>
+          <w:cantSplit/>
+        </w:trPr>
         <w:tc>
           <w:tcPr>
             <w:tcW w:type="dxa" w:w="1900"/>
@@ -9084,6 +9304,7 @@
           </w:tcPr>
           <w:p>
             <w:pPr>
+              <w:keepNext/>
               <w:spacing w:after="0" w:line="276" w:lineRule="auto"/>
               <w:jc w:val="left"/>
             </w:pPr>
@@ -9113,6 +9334,7 @@
           </w:tcPr>
           <w:p>
             <w:pPr>
+              <w:keepNext/>
               <w:spacing w:after="0" w:line="276" w:lineRule="auto"/>
               <w:jc w:val="left"/>
             </w:pPr>
@@ -9129,6 +9351,9 @@
         </w:tc>
       </w:tr>
       <w:tr>
+        <w:trPr>
+          <w:cantSplit/>
+        </w:trPr>
         <w:tc>
           <w:tcPr>
             <w:tcW w:type="dxa" w:w="1900"/>
@@ -9447,7 +9672,7 @@
         </w:rPr>
         <w:t xml:space="preserve">Repositori GitHub: </w:t>
       </w:r>
-      <w:hyperlink w:history="1" r:id="rIdummkddncyazrskaejdfjz">
+      <w:hyperlink w:history="1" r:id="rId6mns-j4kk8qedxitiyijx">
         <w:r>
           <w:rPr>
             <w:rFonts w:ascii="Consolas" w:cs="Consolas" w:eastAsia="Consolas" w:hAnsi="Consolas"/>
@@ -9475,7 +9700,7 @@
         </w:rPr>
         <w:t xml:space="preserve">File laporan HTML ZAP: </w:t>
       </w:r>
-      <w:hyperlink w:history="1" r:id="rIdsoisrws2dfl7yoczqeo-r">
+      <w:hyperlink w:history="1" r:id="rIdp_raxxd33v7f6aeacztl9">
         <w:r>
           <w:rPr>
             <w:rFonts w:ascii="Consolas" w:cs="Consolas" w:eastAsia="Consolas" w:hAnsi="Consolas"/>
@@ -9503,7 +9728,7 @@
         </w:rPr>
         <w:t xml:space="preserve">Pratinjau HTML (rendered): </w:t>
       </w:r>
-      <w:hyperlink w:history="1" r:id="rId6ahe1m91_kyk3culnev8d">
+      <w:hyperlink w:history="1" r:id="rIdcvadas6w3j1abquyzetcg">
         <w:r>
           <w:rPr>
             <w:rFonts w:ascii="Consolas" w:cs="Consolas" w:eastAsia="Consolas" w:hAnsi="Consolas"/>

</xml_diff>